<commit_message>
Add collaborator setup and demonstration guide to the Phase 1 document
Covers required installs, clone/setup steps, and three ways to run the
demo (Swagger UI, Postman, curl) since Phase 1 is API-only, no frontend.
</commit_message>
<xml_diff>
--- a/docs/PHASE1_EXPLANATION.docx
+++ b/docs/PHASE1_EXPLANATION.docx
@@ -3230,6 +3230,1114 @@
         <w:t xml:space="preserve"> -&gt; Pour scaler independamment chaque domaine, isoler les pannes, et permettre des deploiements independants — rendu possible ici par le decoupage modulaire deja en place.</w:t>
       </w:r>
     </w:p>
+    <w:p>
+      <w:r>
+        <w:br w:type="page"/>
+      </w:r>
+    </w:p>
+    <w:p>
+      <w:pPr>
+        <w:pStyle w:val="Heading1"/>
+      </w:pPr>
+      <w:r>
+        <w:t>31. Recuperer le projet en local (pour un collaborateur)</w:t>
+      </w:r>
+    </w:p>
+    <w:p>
+      <w:r>
+        <w:t xml:space="preserve">Le code source complet de la Phase 1 est heberge sur GitHub : </w:t>
+      </w:r>
+      <w:r>
+        <w:rPr>
+          <w:rFonts w:ascii="Consolas" w:hAnsi="Consolas"/>
+          <w:sz w:val="20"/>
+        </w:rPr>
+        <w:t>https://github.com/Jaysondjems/GlobeTrotter2026</w:t>
+      </w:r>
+      <w:r>
+        <w:t>. Cette section explique, etape par etape, comment un collaborateur ajoute au depot peut recuperer le projet, l'installer et le faire fonctionner sur sa propre machine.</w:t>
+      </w:r>
+    </w:p>
+    <w:p>
+      <w:pPr>
+        <w:pStyle w:val="Heading2"/>
+      </w:pPr>
+      <w:r>
+        <w:t>31.1 Elements a installer au prealable</w:t>
+      </w:r>
+    </w:p>
+    <w:tbl>
+      <w:tblPr>
+        <w:tblStyle w:val="LightGrid-Accent1"/>
+        <w:tblW w:type="auto" w:w="0"/>
+        <w:jc w:val="center"/>
+        <w:tblLook w:firstColumn="1" w:firstRow="1" w:lastColumn="0" w:lastRow="0" w:noHBand="0" w:noVBand="1" w:val="04A0"/>
+      </w:tblPr>
+      <w:tblGrid>
+        <w:gridCol w:w="3249"/>
+        <w:gridCol w:w="3249"/>
+        <w:gridCol w:w="3249"/>
+      </w:tblGrid>
+      <w:tr>
+        <w:tc>
+          <w:tcPr>
+            <w:tcW w:type="dxa" w:w="3249"/>
+            <w:shd w:fill="0B1F3A"/>
+          </w:tcPr>
+          <w:p>
+            <w:r/>
+            <w:r>
+              <w:rPr>
+                <w:b/>
+                <w:color w:val="FFFFFF"/>
+              </w:rPr>
+              <w:t>Logiciel</w:t>
+            </w:r>
+          </w:p>
+        </w:tc>
+        <w:tc>
+          <w:tcPr>
+            <w:tcW w:type="dxa" w:w="3249"/>
+            <w:shd w:fill="0B1F3A"/>
+          </w:tcPr>
+          <w:p>
+            <w:r/>
+            <w:r>
+              <w:rPr>
+                <w:b/>
+                <w:color w:val="FFFFFF"/>
+              </w:rPr>
+              <w:t>Version conseillee</w:t>
+            </w:r>
+          </w:p>
+        </w:tc>
+        <w:tc>
+          <w:tcPr>
+            <w:tcW w:type="dxa" w:w="3249"/>
+            <w:shd w:fill="0B1F3A"/>
+          </w:tcPr>
+          <w:p>
+            <w:r/>
+            <w:r>
+              <w:rPr>
+                <w:b/>
+                <w:color w:val="FFFFFF"/>
+              </w:rPr>
+              <w:t>Usage dans le projet</w:t>
+            </w:r>
+          </w:p>
+        </w:tc>
+      </w:tr>
+      <w:tr>
+        <w:tc>
+          <w:tcPr>
+            <w:tcW w:type="dxa" w:w="3249"/>
+          </w:tcPr>
+          <w:p>
+            <w:r/>
+            <w:r>
+              <w:t>Git</w:t>
+            </w:r>
+          </w:p>
+        </w:tc>
+        <w:tc>
+          <w:tcPr>
+            <w:tcW w:type="dxa" w:w="3249"/>
+          </w:tcPr>
+          <w:p>
+            <w:r/>
+            <w:r>
+              <w:t>recente</w:t>
+            </w:r>
+          </w:p>
+        </w:tc>
+        <w:tc>
+          <w:tcPr>
+            <w:tcW w:type="dxa" w:w="3249"/>
+          </w:tcPr>
+          <w:p>
+            <w:r/>
+            <w:r>
+              <w:t>Cloner le depot GitHub</w:t>
+            </w:r>
+          </w:p>
+        </w:tc>
+      </w:tr>
+      <w:tr>
+        <w:tc>
+          <w:tcPr>
+            <w:tcW w:type="dxa" w:w="3249"/>
+          </w:tcPr>
+          <w:p>
+            <w:r/>
+            <w:r>
+              <w:t>Node.js + npm</w:t>
+            </w:r>
+          </w:p>
+        </w:tc>
+        <w:tc>
+          <w:tcPr>
+            <w:tcW w:type="dxa" w:w="3249"/>
+          </w:tcPr>
+          <w:p>
+            <w:r/>
+            <w:r>
+              <w:t>18 LTS ou plus</w:t>
+            </w:r>
+          </w:p>
+        </w:tc>
+        <w:tc>
+          <w:tcPr>
+            <w:tcW w:type="dxa" w:w="3249"/>
+          </w:tcPr>
+          <w:p>
+            <w:r/>
+            <w:r>
+              <w:t>Executer le serveur backend (Node.js/Express)</w:t>
+            </w:r>
+          </w:p>
+        </w:tc>
+      </w:tr>
+      <w:tr>
+        <w:tc>
+          <w:tcPr>
+            <w:tcW w:type="dxa" w:w="3249"/>
+          </w:tcPr>
+          <w:p>
+            <w:r/>
+            <w:r>
+              <w:t>PostgreSQL</w:t>
+            </w:r>
+          </w:p>
+        </w:tc>
+        <w:tc>
+          <w:tcPr>
+            <w:tcW w:type="dxa" w:w="3249"/>
+          </w:tcPr>
+          <w:p>
+            <w:r/>
+            <w:r>
+              <w:t>14 ou plus</w:t>
+            </w:r>
+          </w:p>
+        </w:tc>
+        <w:tc>
+          <w:tcPr>
+            <w:tcW w:type="dxa" w:w="3249"/>
+          </w:tcPr>
+          <w:p>
+            <w:r/>
+            <w:r>
+              <w:t>Base de donnees relationnelle du projet</w:t>
+            </w:r>
+          </w:p>
+        </w:tc>
+      </w:tr>
+      <w:tr>
+        <w:tc>
+          <w:tcPr>
+            <w:tcW w:type="dxa" w:w="3249"/>
+          </w:tcPr>
+          <w:p>
+            <w:r/>
+            <w:r>
+              <w:t>psql ou pgAdmin</w:t>
+            </w:r>
+          </w:p>
+        </w:tc>
+        <w:tc>
+          <w:tcPr>
+            <w:tcW w:type="dxa" w:w="3249"/>
+          </w:tcPr>
+          <w:p>
+            <w:r/>
+            <w:r>
+              <w:t>(fourni avec PostgreSQL)</w:t>
+            </w:r>
+          </w:p>
+        </w:tc>
+        <w:tc>
+          <w:tcPr>
+            <w:tcW w:type="dxa" w:w="3249"/>
+          </w:tcPr>
+          <w:p>
+            <w:r/>
+            <w:r>
+              <w:t>Creer la base de donnees "globetrotter"</w:t>
+            </w:r>
+          </w:p>
+        </w:tc>
+      </w:tr>
+      <w:tr>
+        <w:tc>
+          <w:tcPr>
+            <w:tcW w:type="dxa" w:w="3249"/>
+          </w:tcPr>
+          <w:p>
+            <w:r/>
+            <w:r>
+              <w:t>Postman (optionnel)</w:t>
+            </w:r>
+          </w:p>
+        </w:tc>
+        <w:tc>
+          <w:tcPr>
+            <w:tcW w:type="dxa" w:w="3249"/>
+          </w:tcPr>
+          <w:p>
+            <w:r/>
+            <w:r>
+              <w:t>recente</w:t>
+            </w:r>
+          </w:p>
+        </w:tc>
+        <w:tc>
+          <w:tcPr>
+            <w:tcW w:type="dxa" w:w="3249"/>
+          </w:tcPr>
+          <w:p>
+            <w:r/>
+            <w:r>
+              <w:t>Option B de demonstration de l'API</w:t>
+            </w:r>
+          </w:p>
+        </w:tc>
+      </w:tr>
+      <w:tr>
+        <w:tc>
+          <w:tcPr>
+            <w:tcW w:type="dxa" w:w="3249"/>
+          </w:tcPr>
+          <w:p>
+            <w:r/>
+            <w:r>
+              <w:t>Un navigateur web</w:t>
+            </w:r>
+          </w:p>
+        </w:tc>
+        <w:tc>
+          <w:tcPr>
+            <w:tcW w:type="dxa" w:w="3249"/>
+          </w:tcPr>
+          <w:p>
+            <w:r/>
+            <w:r>
+              <w:t>-</w:t>
+            </w:r>
+          </w:p>
+        </w:tc>
+        <w:tc>
+          <w:tcPr>
+            <w:tcW w:type="dxa" w:w="3249"/>
+          </w:tcPr>
+          <w:p>
+            <w:r/>
+            <w:r>
+              <w:t>Utiliser Swagger UI (option A de demonstration)</w:t>
+            </w:r>
+          </w:p>
+        </w:tc>
+      </w:tr>
+    </w:tbl>
+    <w:p/>
+    <w:p>
+      <w:r>
+        <w:t xml:space="preserve">Astuce : pour verifier que Node.js, npm et PostgreSQL sont bien installes, ouvrir un terminal et taper </w:t>
+      </w:r>
+      <w:r>
+        <w:rPr>
+          <w:rFonts w:ascii="Consolas" w:hAnsi="Consolas"/>
+          <w:sz w:val="20"/>
+        </w:rPr>
+        <w:t>node -v</w:t>
+      </w:r>
+      <w:r>
+        <w:t xml:space="preserve">, </w:t>
+      </w:r>
+      <w:r>
+        <w:rPr>
+          <w:rFonts w:ascii="Consolas" w:hAnsi="Consolas"/>
+          <w:sz w:val="20"/>
+        </w:rPr>
+        <w:t>npm -v</w:t>
+      </w:r>
+      <w:r>
+        <w:t xml:space="preserve">, et </w:t>
+      </w:r>
+      <w:r>
+        <w:rPr>
+          <w:rFonts w:ascii="Consolas" w:hAnsi="Consolas"/>
+          <w:sz w:val="20"/>
+        </w:rPr>
+        <w:t>psql --version</w:t>
+      </w:r>
+      <w:r>
+        <w:t>.</w:t>
+      </w:r>
+    </w:p>
+    <w:p>
+      <w:pPr>
+        <w:pStyle w:val="Heading2"/>
+      </w:pPr>
+      <w:r>
+        <w:t>31.2 Etapes de recuperation et de configuration</w:t>
+      </w:r>
+    </w:p>
+    <w:p>
+      <w:pPr>
+        <w:pStyle w:val="ListNumber"/>
+      </w:pPr>
+      <w:r>
+        <w:t xml:space="preserve">Cloner le depot : </w:t>
+      </w:r>
+      <w:r>
+        <w:rPr>
+          <w:rFonts w:ascii="Consolas" w:hAnsi="Consolas"/>
+          <w:sz w:val="20"/>
+        </w:rPr>
+        <w:t>git clone git@github.com:Jaysondjems/GlobeTrotter2026.git</w:t>
+      </w:r>
+      <w:r>
+        <w:t xml:space="preserve"> (ou en HTTPS : </w:t>
+      </w:r>
+      <w:r>
+        <w:rPr>
+          <w:rFonts w:ascii="Consolas" w:hAnsi="Consolas"/>
+          <w:sz w:val="20"/>
+        </w:rPr>
+        <w:t>git clone https://github.com/Jaysondjems/GlobeTrotter2026.git</w:t>
+      </w:r>
+      <w:r>
+        <w:t>)</w:t>
+      </w:r>
+    </w:p>
+    <w:p>
+      <w:pPr>
+        <w:pStyle w:val="ListNumber"/>
+      </w:pPr>
+      <w:r>
+        <w:t xml:space="preserve">Se placer dans le dossier du backend : </w:t>
+      </w:r>
+      <w:r>
+        <w:rPr>
+          <w:rFonts w:ascii="Consolas" w:hAnsi="Consolas"/>
+          <w:sz w:val="20"/>
+        </w:rPr>
+        <w:t>cd GlobeTrotter2026/backend</w:t>
+      </w:r>
+    </w:p>
+    <w:p>
+      <w:pPr>
+        <w:pStyle w:val="ListNumber"/>
+      </w:pPr>
+      <w:r>
+        <w:t xml:space="preserve">Installer les dependances Node.js : </w:t>
+      </w:r>
+      <w:r>
+        <w:rPr>
+          <w:rFonts w:ascii="Consolas" w:hAnsi="Consolas"/>
+          <w:sz w:val="20"/>
+        </w:rPr>
+        <w:t>npm install</w:t>
+      </w:r>
+    </w:p>
+    <w:p>
+      <w:pPr>
+        <w:pStyle w:val="ListNumber"/>
+      </w:pPr>
+      <w:r>
+        <w:t xml:space="preserve">Creer le fichier de configuration : copier </w:t>
+      </w:r>
+      <w:r>
+        <w:rPr>
+          <w:rFonts w:ascii="Consolas" w:hAnsi="Consolas"/>
+          <w:sz w:val="20"/>
+        </w:rPr>
+        <w:t>.env.example</w:t>
+      </w:r>
+      <w:r>
+        <w:t xml:space="preserve"> en </w:t>
+      </w:r>
+      <w:r>
+        <w:rPr>
+          <w:rFonts w:ascii="Consolas" w:hAnsi="Consolas"/>
+          <w:sz w:val="20"/>
+        </w:rPr>
+        <w:t>.env</w:t>
+      </w:r>
+    </w:p>
+    <w:p>
+      <w:pPr>
+        <w:pStyle w:val="ListNumber"/>
+      </w:pPr>
+      <w:r>
+        <w:t xml:space="preserve">Editer </w:t>
+      </w:r>
+      <w:r>
+        <w:rPr>
+          <w:rFonts w:ascii="Consolas" w:hAnsi="Consolas"/>
+          <w:sz w:val="20"/>
+        </w:rPr>
+        <w:t>.env</w:t>
+      </w:r>
+      <w:r>
+        <w:t xml:space="preserve"> et renseigner deux valeurs : </w:t>
+      </w:r>
+      <w:r>
+        <w:rPr>
+          <w:rFonts w:ascii="Consolas" w:hAnsi="Consolas"/>
+          <w:sz w:val="20"/>
+        </w:rPr>
+        <w:t>DATABASE_URL</w:t>
+      </w:r>
+      <w:r>
+        <w:t xml:space="preserve"> (avec l'utilisateur/mot de passe PostgreSQL local) et </w:t>
+      </w:r>
+      <w:r>
+        <w:rPr>
+          <w:rFonts w:ascii="Consolas" w:hAnsi="Consolas"/>
+          <w:sz w:val="20"/>
+        </w:rPr>
+        <w:t>JWT_SECRET</w:t>
+      </w:r>
+      <w:r>
+        <w:t xml:space="preserve"> (une chaine aleatoire quelconque)</w:t>
+      </w:r>
+    </w:p>
+    <w:p>
+      <w:pPr>
+        <w:pStyle w:val="ListNumber"/>
+      </w:pPr>
+      <w:r>
+        <w:t xml:space="preserve">Creer la base de donnees PostgreSQL, par exemple avec psql : </w:t>
+      </w:r>
+      <w:r>
+        <w:rPr>
+          <w:rFonts w:ascii="Consolas" w:hAnsi="Consolas"/>
+          <w:sz w:val="20"/>
+        </w:rPr>
+        <w:t>CREATE DATABASE globetrotter;</w:t>
+      </w:r>
+    </w:p>
+    <w:p>
+      <w:pPr>
+        <w:pStyle w:val="ListNumber"/>
+      </w:pPr>
+      <w:r>
+        <w:t xml:space="preserve">Appliquer le schema de base de donnees : </w:t>
+      </w:r>
+      <w:r>
+        <w:rPr>
+          <w:rFonts w:ascii="Consolas" w:hAnsi="Consolas"/>
+          <w:sz w:val="20"/>
+        </w:rPr>
+        <w:t>npm run prisma:migrate</w:t>
+      </w:r>
+    </w:p>
+    <w:p>
+      <w:pPr>
+        <w:pStyle w:val="ListNumber"/>
+      </w:pPr>
+      <w:r>
+        <w:t xml:space="preserve">Charger les donnees de demonstration (utilisateurs, destinations, itineraires) : </w:t>
+      </w:r>
+      <w:r>
+        <w:rPr>
+          <w:rFonts w:ascii="Consolas" w:hAnsi="Consolas"/>
+          <w:sz w:val="20"/>
+        </w:rPr>
+        <w:t>npm run seed</w:t>
+      </w:r>
+    </w:p>
+    <w:p>
+      <w:pPr>
+        <w:pStyle w:val="ListNumber"/>
+      </w:pPr>
+      <w:r>
+        <w:t xml:space="preserve">Demarrer le serveur : </w:t>
+      </w:r>
+      <w:r>
+        <w:rPr>
+          <w:rFonts w:ascii="Consolas" w:hAnsi="Consolas"/>
+          <w:sz w:val="20"/>
+        </w:rPr>
+        <w:t>npm start</w:t>
+      </w:r>
+    </w:p>
+    <w:p>
+      <w:pPr>
+        <w:pStyle w:val="ListNumber"/>
+      </w:pPr>
+      <w:r>
+        <w:t xml:space="preserve">Verifier que tout fonctionne : ouvrir </w:t>
+      </w:r>
+      <w:r>
+        <w:rPr>
+          <w:rFonts w:ascii="Consolas" w:hAnsi="Consolas"/>
+          <w:sz w:val="20"/>
+        </w:rPr>
+        <w:t>http://localhost:3000/health</w:t>
+      </w:r>
+      <w:r>
+        <w:t xml:space="preserve"> dans un navigateur -&gt; doit afficher </w:t>
+      </w:r>
+      <w:r>
+        <w:rPr>
+          <w:rFonts w:ascii="Consolas" w:hAnsi="Consolas"/>
+          <w:sz w:val="20"/>
+        </w:rPr>
+        <w:t>{"status":"ok","database":"connected"}</w:t>
+      </w:r>
+    </w:p>
+    <w:p>
+      <w:r>
+        <w:rPr>
+          <w:b/>
+        </w:rPr>
+        <w:t>Identifiants de demonstration deja crees par le seed</w:t>
+      </w:r>
+      <w:r>
+        <w:t xml:space="preserve"> (voir </w:t>
+      </w:r>
+      <w:r>
+        <w:rPr>
+          <w:rFonts w:ascii="Consolas" w:hAnsi="Consolas"/>
+          <w:sz w:val="20"/>
+        </w:rPr>
+        <w:t>prisma/seed.js</w:t>
+      </w:r>
+      <w:r>
+        <w:t xml:space="preserve">) : 8 utilisateurs, tous avec le mot de passe </w:t>
+      </w:r>
+      <w:r>
+        <w:rPr>
+          <w:rFonts w:ascii="Consolas" w:hAnsi="Consolas"/>
+          <w:sz w:val="20"/>
+        </w:rPr>
+        <w:t>Password123!</w:t>
+      </w:r>
+      <w:r>
+        <w:t xml:space="preserve">, par exemple </w:t>
+      </w:r>
+      <w:r>
+        <w:rPr>
+          <w:rFonts w:ascii="Consolas" w:hAnsi="Consolas"/>
+          <w:sz w:val="20"/>
+        </w:rPr>
+        <w:t>alice.martin@example.com</w:t>
+      </w:r>
+      <w:r>
+        <w:t>. 25 destinations et 3 itineraires d'exemple sont egalement charges automatiquement.</w:t>
+      </w:r>
+    </w:p>
+    <w:p>
+      <w:r>
+        <w:rPr>
+          <w:b/>
+        </w:rPr>
+        <w:t>Commande de verification supplementaire (fortement conseillee avant la presentation)</w:t>
+      </w:r>
+      <w:r>
+        <w:t xml:space="preserve"> : </w:t>
+      </w:r>
+      <w:r>
+        <w:rPr>
+          <w:rFonts w:ascii="Consolas" w:hAnsi="Consolas"/>
+          <w:sz w:val="20"/>
+        </w:rPr>
+        <w:t>npm test</w:t>
+      </w:r>
+      <w:r>
+        <w:t xml:space="preserve"> doit afficher 5 suites et 24 tests reussis. Cela confirme que l'installation est correcte independamment de la demo elle-meme.</w:t>
+      </w:r>
+    </w:p>
+    <w:p>
+      <w:pPr>
+        <w:pStyle w:val="Heading1"/>
+      </w:pPr>
+      <w:r>
+        <w:t>32. Comment faire la demonstration</w:t>
+      </w:r>
+    </w:p>
+    <w:p>
+      <w:r>
+        <w:t xml:space="preserve">Le projet est une </w:t>
+      </w:r>
+      <w:r>
+        <w:rPr>
+          <w:b/>
+        </w:rPr>
+        <w:t>API REST sans interface graphique</w:t>
+      </w:r>
+      <w:r>
+        <w:t xml:space="preserve"> (aucun frontend n'est demande pour la Phase 1 — l'objectif annonce du cours est explicitement « Build a working REST API »). La demonstration consiste donc a montrer que l'API repond correctement aux requetes HTTP, en suivant le scenario metier complet : inscription -&gt; recherche de destinations -&gt; creation d'un itineraire -&gt; ajout d'etapes -&gt; recommandations personnalisees -&gt; partage. Trois options sont possibles, de la plus simple a presenter a la plus technique.</w:t>
+      </w:r>
+    </w:p>
+    <w:p>
+      <w:pPr>
+        <w:pStyle w:val="Heading2"/>
+      </w:pPr>
+      <w:r>
+        <w:t>Option A — Swagger UI (recommandee, la plus visuelle)</w:t>
+      </w:r>
+    </w:p>
+    <w:p>
+      <w:r>
+        <w:t>Une fois le serveur demarre (</w:t>
+      </w:r>
+      <w:r>
+        <w:rPr>
+          <w:rFonts w:ascii="Consolas" w:hAnsi="Consolas"/>
+          <w:sz w:val="20"/>
+        </w:rPr>
+        <w:t>npm start</w:t>
+      </w:r>
+      <w:r>
+        <w:t xml:space="preserve">), ouvrir dans un navigateur : </w:t>
+      </w:r>
+      <w:r>
+        <w:rPr>
+          <w:rFonts w:ascii="Consolas" w:hAnsi="Consolas"/>
+          <w:sz w:val="20"/>
+        </w:rPr>
+        <w:t>http://localhost:3000/api-docs</w:t>
+      </w:r>
+      <w:r>
+        <w:t xml:space="preserve">. Chaque endpoint de l'API y est liste par domaine (Auth, Users, Destinations, Recommendations, Itineraries, Sharing, Health), avec un bouton </w:t>
+      </w:r>
+      <w:r>
+        <w:rPr>
+          <w:b/>
+        </w:rPr>
+        <w:t>Try it out</w:t>
+      </w:r>
+      <w:r>
+        <w:t xml:space="preserve"> qui permet de remplir les champs et d'executer directement la requete devant l'examinateur ; la reponse JSON s'affiche immediatement a l'ecran.</w:t>
+      </w:r>
+    </w:p>
+    <w:p>
+      <w:r>
+        <w:t>Deroule de demonstration conseille dans Swagger :</w:t>
+      </w:r>
+    </w:p>
+    <w:p>
+      <w:pPr>
+        <w:pStyle w:val="ListNumber"/>
+      </w:pPr>
+      <w:r>
+        <w:rPr>
+          <w:rFonts w:ascii="Consolas" w:hAnsi="Consolas"/>
+          <w:sz w:val="20"/>
+        </w:rPr>
+        <w:t>POST /api/auth/register</w:t>
+      </w:r>
+      <w:r>
+        <w:t xml:space="preserve"> -&gt; creer un compte de demo, recuperer le </w:t>
+      </w:r>
+      <w:r>
+        <w:rPr>
+          <w:rFonts w:ascii="Consolas" w:hAnsi="Consolas"/>
+          <w:sz w:val="20"/>
+        </w:rPr>
+        <w:t>token</w:t>
+      </w:r>
+      <w:r>
+        <w:t xml:space="preserve"> retourne dans la reponse.</w:t>
+      </w:r>
+    </w:p>
+    <w:p>
+      <w:pPr>
+        <w:pStyle w:val="ListNumber"/>
+      </w:pPr>
+      <w:r>
+        <w:t xml:space="preserve">Cliquer sur le bouton </w:t>
+      </w:r>
+      <w:r>
+        <w:rPr>
+          <w:b/>
+        </w:rPr>
+        <w:t>Authorize</w:t>
+      </w:r>
+      <w:r>
+        <w:t xml:space="preserve"> (cadenas en haut de la page Swagger) et coller </w:t>
+      </w:r>
+      <w:r>
+        <w:rPr>
+          <w:rFonts w:ascii="Consolas" w:hAnsi="Consolas"/>
+          <w:sz w:val="20"/>
+        </w:rPr>
+        <w:t>Bearer &lt;token&gt;</w:t>
+      </w:r>
+      <w:r>
+        <w:t>.</w:t>
+      </w:r>
+    </w:p>
+    <w:p>
+      <w:pPr>
+        <w:pStyle w:val="ListNumber"/>
+      </w:pPr>
+      <w:r>
+        <w:rPr>
+          <w:rFonts w:ascii="Consolas" w:hAnsi="Consolas"/>
+          <w:sz w:val="20"/>
+        </w:rPr>
+        <w:t>GET /api/destinations</w:t>
+      </w:r>
+      <w:r>
+        <w:t xml:space="preserve"> avec des parametres </w:t>
+      </w:r>
+      <w:r>
+        <w:rPr>
+          <w:rFonts w:ascii="Consolas" w:hAnsi="Consolas"/>
+          <w:sz w:val="20"/>
+        </w:rPr>
+        <w:t>category=beach</w:t>
+      </w:r>
+      <w:r>
+        <w:t xml:space="preserve"> et </w:t>
+      </w:r>
+      <w:r>
+        <w:rPr>
+          <w:rFonts w:ascii="Consolas" w:hAnsi="Consolas"/>
+          <w:sz w:val="20"/>
+        </w:rPr>
+        <w:t>minBudget</w:t>
+      </w:r>
+      <w:r>
+        <w:t>/</w:t>
+      </w:r>
+      <w:r>
+        <w:rPr>
+          <w:rFonts w:ascii="Consolas" w:hAnsi="Consolas"/>
+          <w:sz w:val="20"/>
+        </w:rPr>
+        <w:t>maxBudget</w:t>
+      </w:r>
+      <w:r>
+        <w:t xml:space="preserve"> -&gt; montrer la recherche filtree et la pagination.</w:t>
+      </w:r>
+    </w:p>
+    <w:p>
+      <w:pPr>
+        <w:pStyle w:val="ListNumber"/>
+      </w:pPr>
+      <w:r>
+        <w:rPr>
+          <w:rFonts w:ascii="Consolas" w:hAnsi="Consolas"/>
+          <w:sz w:val="20"/>
+        </w:rPr>
+        <w:t>GET /api/users/{id}/recommendations</w:t>
+      </w:r>
+      <w:r>
+        <w:t xml:space="preserve"> avec l'id de l'utilisateur cree -&gt; montrer le score explique par destination.</w:t>
+      </w:r>
+    </w:p>
+    <w:p>
+      <w:pPr>
+        <w:pStyle w:val="ListNumber"/>
+      </w:pPr>
+      <w:r>
+        <w:rPr>
+          <w:rFonts w:ascii="Consolas" w:hAnsi="Consolas"/>
+          <w:sz w:val="20"/>
+        </w:rPr>
+        <w:t>POST /api/itineraries</w:t>
+      </w:r>
+      <w:r>
+        <w:t xml:space="preserve"> -&gt; creer un itineraire.</w:t>
+      </w:r>
+    </w:p>
+    <w:p>
+      <w:pPr>
+        <w:pStyle w:val="ListNumber"/>
+      </w:pPr>
+      <w:r>
+        <w:rPr>
+          <w:rFonts w:ascii="Consolas" w:hAnsi="Consolas"/>
+          <w:sz w:val="20"/>
+        </w:rPr>
+        <w:t>POST /api/itineraries/{id}/items</w:t>
+      </w:r>
+      <w:r>
+        <w:t xml:space="preserve"> -&gt; ajouter une etape liee a une destination.</w:t>
+      </w:r>
+    </w:p>
+    <w:p>
+      <w:pPr>
+        <w:pStyle w:val="ListNumber"/>
+      </w:pPr>
+      <w:r>
+        <w:rPr>
+          <w:rFonts w:ascii="Consolas" w:hAnsi="Consolas"/>
+          <w:sz w:val="20"/>
+        </w:rPr>
+        <w:t>POST /api/itineraries/{id}/share</w:t>
+      </w:r>
+      <w:r>
+        <w:t xml:space="preserve"> -&gt; generer un lien de partage.</w:t>
+      </w:r>
+    </w:p>
+    <w:p>
+      <w:pPr>
+        <w:pStyle w:val="ListNumber"/>
+      </w:pPr>
+      <w:r>
+        <w:rPr>
+          <w:rFonts w:ascii="Consolas" w:hAnsi="Consolas"/>
+          <w:sz w:val="20"/>
+        </w:rPr>
+        <w:t>GET /api/shared/itineraries/{shareToken}</w:t>
+      </w:r>
+      <w:r>
+        <w:t xml:space="preserve"> (sans le bouton Authorize actif) -&gt; montrer que le partage fonctionne sans authentification.</w:t>
+      </w:r>
+    </w:p>
+    <w:p>
+      <w:pPr>
+        <w:pStyle w:val="Heading2"/>
+      </w:pPr>
+      <w:r>
+        <w:t>Option B — Collection Postman</w:t>
+      </w:r>
+    </w:p>
+    <w:p>
+      <w:r>
+        <w:t xml:space="preserve">Alternative a Swagger : creer une collection Postman avec les memes requetes que ci-dessus, dans le meme ordre. Avantage : on peut enchainer les appels tres rapidement et sauvegarder automatiquement le </w:t>
+      </w:r>
+      <w:r>
+        <w:rPr>
+          <w:rFonts w:ascii="Consolas" w:hAnsi="Consolas"/>
+          <w:sz w:val="20"/>
+        </w:rPr>
+        <w:t>token</w:t>
+      </w:r>
+      <w:r>
+        <w:t xml:space="preserve"> et les identifiants (</w:t>
+      </w:r>
+      <w:r>
+        <w:rPr>
+          <w:rFonts w:ascii="Consolas" w:hAnsi="Consolas"/>
+          <w:sz w:val="20"/>
+        </w:rPr>
+        <w:t>itineraryId</w:t>
+      </w:r>
+      <w:r>
+        <w:t xml:space="preserve">, </w:t>
+      </w:r>
+      <w:r>
+        <w:rPr>
+          <w:rFonts w:ascii="Consolas" w:hAnsi="Consolas"/>
+          <w:sz w:val="20"/>
+        </w:rPr>
+        <w:t>destinationId</w:t>
+      </w:r>
+      <w:r>
+        <w:t>) d'une requete a l'autre grace aux variables d'environnement Postman, ce qui rend la demo plus fluide si elle a deja ete repetee avant la soutenance.</w:t>
+      </w:r>
+    </w:p>
+    <w:p>
+      <w:pPr>
+        <w:pStyle w:val="Heading2"/>
+      </w:pPr>
+      <w:r>
+        <w:t>Option C — Ligne de commande (curl), en secours</w:t>
+      </w:r>
+    </w:p>
+    <w:p>
+      <w:r>
+        <w:t>Si aucune interface (navigateur, Postman) n'est disponible le jour de la presentation, le meme scenario peut etre execute directement au terminal :</w:t>
+      </w:r>
+    </w:p>
+    <w:p>
+      <w:pPr>
+        <w:spacing w:before="80" w:after="80"/>
+        <w:ind w:left="283"/>
+      </w:pPr>
+      <w:r>
+        <w:rPr>
+          <w:rFonts w:ascii="Consolas" w:hAnsi="Consolas"/>
+          <w:sz w:val="19"/>
+        </w:rPr>
+        <w:t># 1) Sante de l'API</w:t>
+        <w:br/>
+        <w:t>curl http://localhost:3000/health</w:t>
+        <w:br/>
+        <w:br/>
+        <w:t># 2) Inscription (recupere un token JWT)</w:t>
+        <w:br/>
+        <w:t>curl -X POST http://localhost:3000/api/auth/register \</w:t>
+        <w:br/>
+        <w:t xml:space="preserve">  -H "Content-Type: application/json" \</w:t>
+        <w:br/>
+        <w:t xml:space="preserve">  -d '{"firstName":"Demo","lastName":"User","email":"demo@test.com","password":"secret123"}'</w:t>
+        <w:br/>
+        <w:br/>
+        <w:t># 3) Recherche de destinations filtree</w:t>
+        <w:br/>
+        <w:t>curl "http://localhost:3000/api/destinations?category=beach&amp;minBudget=500&amp;maxBudget=2000"</w:t>
+        <w:br/>
+        <w:br/>
+        <w:t># 4) Recommandations personnalisees (remplacer &lt;userId&gt; par l'id recu a l'etape 2)</w:t>
+        <w:br/>
+        <w:t>curl http://localhost:3000/api/users/&lt;userId&gt;/recommendations</w:t>
+        <w:br/>
+        <w:br/>
+        <w:t># 5) Creation d'un itineraire (remplacer &lt;token&gt; par le token recu a l'etape 2)</w:t>
+        <w:br/>
+        <w:t>curl -X POST http://localhost:3000/api/itineraries \</w:t>
+        <w:br/>
+        <w:t xml:space="preserve">  -H "Content-Type: application/json" \</w:t>
+        <w:br/>
+        <w:t xml:space="preserve">  -H "Authorization: Bearer &lt;token&gt;" \</w:t>
+        <w:br/>
+        <w:t xml:space="preserve">  -d '{"title":"Trip to Bali","startDate":"2026-06-01","endDate":"2026-06-10"}'</w:t>
+        <w:br/>
+        <w:br/>
+        <w:t># 6) Partage de l'itineraire (remplacer &lt;itineraryId&gt; par l'id recu a l'etape 5)</w:t>
+        <w:br/>
+        <w:t>curl -X POST http://localhost:3000/api/itineraries/&lt;itineraryId&gt;/share \</w:t>
+        <w:br/>
+        <w:t xml:space="preserve">  -H "Authorization: Bearer &lt;token&gt;"</w:t>
+        <w:br/>
+        <w:br/>
+        <w:t># 7) Consultation publique du lien de partage (remplacer &lt;shareToken&gt;)</w:t>
+        <w:br/>
+        <w:t>curl http://localhost:3000/api/shared/itineraries/&lt;shareToken&gt;</w:t>
+      </w:r>
+    </w:p>
+    <w:p>
+      <w:pPr>
+        <w:pStyle w:val="Heading2"/>
+      </w:pPr>
+      <w:r>
+        <w:t>Ce qu'il faut souligner pendant la demonstration</w:t>
+      </w:r>
+    </w:p>
+    <w:p>
+      <w:pPr>
+        <w:pStyle w:val="ListBullet"/>
+      </w:pPr>
+      <w:r>
+        <w:t xml:space="preserve">Le format de reponse </w:t>
+      </w:r>
+      <w:r>
+        <w:rPr>
+          <w:b/>
+        </w:rPr>
+        <w:t>uniforme</w:t>
+      </w:r>
+      <w:r>
+        <w:t xml:space="preserve"> </w:t>
+      </w:r>
+      <w:r>
+        <w:rPr>
+          <w:rFonts w:ascii="Consolas" w:hAnsi="Consolas"/>
+          <w:sz w:val="20"/>
+        </w:rPr>
+        <w:t>{success, data}</w:t>
+      </w:r>
+      <w:r>
+        <w:t xml:space="preserve"> / </w:t>
+      </w:r>
+      <w:r>
+        <w:rPr>
+          <w:rFonts w:ascii="Consolas" w:hAnsi="Consolas"/>
+          <w:sz w:val="20"/>
+        </w:rPr>
+        <w:t>{success:false, error}</w:t>
+      </w:r>
+      <w:r>
+        <w:t xml:space="preserve"> sur tous les endpoints.</w:t>
+      </w:r>
+    </w:p>
+    <w:p>
+      <w:pPr>
+        <w:pStyle w:val="ListBullet"/>
+      </w:pPr>
+      <w:r>
+        <w:t>Les codes HTTP corrects (</w:t>
+      </w:r>
+      <w:r>
+        <w:rPr>
+          <w:b/>
+        </w:rPr>
+        <w:t>201</w:t>
+      </w:r>
+      <w:r>
+        <w:t xml:space="preserve"> a la creation, </w:t>
+      </w:r>
+      <w:r>
+        <w:rPr>
+          <w:b/>
+        </w:rPr>
+        <w:t>204</w:t>
+      </w:r>
+      <w:r>
+        <w:t xml:space="preserve"> a la suppression, </w:t>
+      </w:r>
+      <w:r>
+        <w:rPr>
+          <w:b/>
+        </w:rPr>
+        <w:t>404</w:t>
+      </w:r>
+      <w:r>
+        <w:t xml:space="preserve"> sur une ressource inexistante, </w:t>
+      </w:r>
+      <w:r>
+        <w:rPr>
+          <w:b/>
+        </w:rPr>
+        <w:t>401</w:t>
+      </w:r>
+      <w:r>
+        <w:t xml:space="preserve"> sans token).</w:t>
+      </w:r>
+    </w:p>
+    <w:p>
+      <w:pPr>
+        <w:pStyle w:val="ListBullet"/>
+      </w:pPr>
+      <w:r>
+        <w:t>La protection par JWT des routes personnelles (</w:t>
+      </w:r>
+      <w:r>
+        <w:rPr>
+          <w:rFonts w:ascii="Consolas" w:hAnsi="Consolas"/>
+          <w:sz w:val="20"/>
+        </w:rPr>
+        <w:t>itineraries</w:t>
+      </w:r>
+      <w:r>
+        <w:t>) : montrer qu'un appel sans token echoue en 401.</w:t>
+      </w:r>
+    </w:p>
+    <w:p>
+      <w:pPr>
+        <w:pStyle w:val="ListBullet"/>
+      </w:pPr>
+      <w:r>
+        <w:t>Le caractere explicable des recommandations (le score et les raisons sont retournes dans la reponse, pas une boite noire).</w:t>
+      </w:r>
+    </w:p>
+    <w:p>
+      <w:pPr>
+        <w:pStyle w:val="ListBullet"/>
+      </w:pPr>
+      <w:r>
+        <w:t xml:space="preserve">Que </w:t>
+      </w:r>
+      <w:r>
+        <w:rPr>
+          <w:rFonts w:ascii="Consolas" w:hAnsi="Consolas"/>
+          <w:sz w:val="20"/>
+        </w:rPr>
+        <w:t>passwordHash</w:t>
+      </w:r>
+      <w:r>
+        <w:t xml:space="preserve"> n'apparait jamais dans les reponses API.</w:t>
+      </w:r>
+    </w:p>
     <w:sectPr>
       <w:pgSz w:w="12240" w:h="15840"/>
       <w:pgMar w:top="1134" w:right="1247" w:bottom="1134" w:left="1247" w:header="720" w:footer="720" w:gutter="0"/>

</xml_diff>